<commit_message>
Unit 5: whole-book LIRN references without links; add LIRN citation rule to steering
</commit_message>
<xml_diff>
--- a/Term_02/CS 1101-01 Programming Fundamentals - AY2027-T1/Assignments/Unit 5 Assignment - Rafi.docx
+++ b/Term_02/CS 1101-01 Programming Fundamentals - AY2027-T1/Assignments/Unit 5 Assignment - Rafi.docx
@@ -1876,7 +1876,7 @@
           <w:i w:val="0"/>
           <w:sz w:val="24"/>
         </w:rPr>
-        <w:t xml:space="preserve">Mohbey, K. K., &amp; Acharya, M. (2023). Tuple and dictionaries. In </w:t>
+        <w:t xml:space="preserve">Mohbey, K. K., &amp; Acharya, M. (2023). </w:t>
       </w:r>
       <w:r>
         <w:rPr>
@@ -1885,7 +1885,7 @@
           <w:i/>
           <w:sz w:val="24"/>
         </w:rPr>
-        <w:t xml:space="preserve">Basics of Python programming: A quick guide for beginners</w:t>
+        <w:t xml:space="preserve">Basics of python programming : A quick guide for beginners</w:t>
       </w:r>
       <w:r>
         <w:rPr>
@@ -1894,19 +1894,8 @@
           <w:i w:val="0"/>
           <w:sz w:val="24"/>
         </w:rPr>
-        <w:t xml:space="preserve">. Bentham Science Publishers. </w:t>
+        <w:t xml:space="preserve">. Bentham Science Publishers.</w:t>
       </w:r>
-      <w:hyperlink r:id="rId13">
-        <w:r>
-          <w:rPr>
-            <w:rFonts w:ascii="Times New Roman" w:hAnsi="Times New Roman" w:cs="Times New Roman"/>
-            <w:color w:val="0563C1"/>
-            <w:u w:val="single"/>
-            <w:sz w:val="24"/>
-          </w:rPr>
-          <w:t>http://ebookcentral.proquest.com/lib/univ-people-ebooks/detail.action?docID=31025226</w:t>
-        </w:r>
-      </w:hyperlink>
     </w:p>
     <w:p>
       <w:pPr>
@@ -1920,7 +1909,7 @@
           <w:i w:val="0"/>
           <w:sz w:val="24"/>
         </w:rPr>
-        <w:t xml:space="preserve">Parker, J. R. (2021). Sequences: Strings, tuples, and lists. In </w:t>
+        <w:t xml:space="preserve">Parker, J. R. (2021). </w:t>
       </w:r>
       <w:r>
         <w:rPr>
@@ -1929,7 +1918,7 @@
           <w:i/>
           <w:sz w:val="24"/>
         </w:rPr>
-        <w:t xml:space="preserve">Python: An introduction to programming</w:t>
+        <w:t xml:space="preserve">Python. an introduction to programming</w:t>
       </w:r>
       <w:r>
         <w:rPr>
@@ -1938,19 +1927,8 @@
           <w:i w:val="0"/>
           <w:sz w:val="24"/>
         </w:rPr>
-        <w:t xml:space="preserve">. Mercury Learning &amp; Information. </w:t>
+        <w:t xml:space="preserve">. Mercury Learning &amp; Information.</w:t>
       </w:r>
-      <w:hyperlink r:id="rId14">
-        <w:r>
-          <w:rPr>
-            <w:rFonts w:ascii="Times New Roman" w:hAnsi="Times New Roman" w:cs="Times New Roman"/>
-            <w:color w:val="0563C1"/>
-            <w:u w:val="single"/>
-            <w:sz w:val="24"/>
-          </w:rPr>
-          <w:t>http://ebookcentral.proquest.com/lib/univ-people-ebooks/detail.action?docID=4895083</w:t>
-        </w:r>
-      </w:hyperlink>
     </w:p>
     <w:p>
       <w:pPr>

</xml_diff>